<commit_message>
Update styles and add Vercel link in documentation
</commit_message>
<xml_diff>
--- a/Online Complaint Management System.docx
+++ b/Online Complaint Management System.docx
@@ -229,15 +229,7 @@
           <w:kern w:val="0"/>
           <w14:ligatures w14:val="none"/>
         </w:rPr>
-        <w:t>Priority Level</w:t>
-      </w:r>
-      <w:r>
-        <w:rPr>
-          <w:rFonts w:ascii="Times New Roman" w:eastAsia="Times New Roman" w:hAnsi="Times New Roman" w:cs="Times New Roman"/>
-          <w:kern w:val="0"/>
-          <w14:ligatures w14:val="none"/>
-        </w:rPr>
-        <w:t>,</w:t>
+        <w:t>Priority Level,</w:t>
       </w:r>
       <w:r>
         <w:rPr>
@@ -604,25 +596,7 @@
           <w:kern w:val="0"/>
           <w14:ligatures w14:val="none"/>
         </w:rPr>
-        <w:t xml:space="preserve"> JWT (JSON Web Token) / </w:t>
-      </w:r>
-      <w:proofErr w:type="spellStart"/>
-      <w:r>
-        <w:rPr>
-          <w:rFonts w:ascii="Times New Roman" w:eastAsia="Times New Roman" w:hAnsi="Times New Roman" w:cs="Times New Roman"/>
-          <w:kern w:val="0"/>
-          <w14:ligatures w14:val="none"/>
-        </w:rPr>
-        <w:t>bcrypt</w:t>
-      </w:r>
-      <w:proofErr w:type="spellEnd"/>
-      <w:r>
-        <w:rPr>
-          <w:rFonts w:ascii="Times New Roman" w:eastAsia="Times New Roman" w:hAnsi="Times New Roman" w:cs="Times New Roman"/>
-          <w:kern w:val="0"/>
-          <w14:ligatures w14:val="none"/>
-        </w:rPr>
-        <w:t xml:space="preserve"> </w:t>
+        <w:t xml:space="preserve"> JWT (JSON Web Token) / bcrypt </w:t>
       </w:r>
     </w:p>
     <w:p>
@@ -655,25 +629,7 @@
           <w:kern w:val="0"/>
           <w14:ligatures w14:val="none"/>
         </w:rPr>
-        <w:t xml:space="preserve"> </w:t>
-      </w:r>
-      <w:proofErr w:type="spellStart"/>
-      <w:r>
-        <w:rPr>
-          <w:rFonts w:ascii="Times New Roman" w:eastAsia="Times New Roman" w:hAnsi="Times New Roman" w:cs="Times New Roman"/>
-          <w:kern w:val="0"/>
-          <w14:ligatures w14:val="none"/>
-        </w:rPr>
-        <w:t>dotenv</w:t>
-      </w:r>
-      <w:proofErr w:type="spellEnd"/>
-      <w:r>
-        <w:rPr>
-          <w:rFonts w:ascii="Times New Roman" w:eastAsia="Times New Roman" w:hAnsi="Times New Roman" w:cs="Times New Roman"/>
-          <w:kern w:val="0"/>
-          <w14:ligatures w14:val="none"/>
-        </w:rPr>
-        <w:t xml:space="preserve"> </w:t>
+        <w:t xml:space="preserve"> dotenv </w:t>
       </w:r>
     </w:p>
     <w:p>
@@ -708,18 +664,8 @@
           <w:kern w:val="0"/>
           <w14:ligatures w14:val="none"/>
         </w:rPr>
-        <w:t xml:space="preserve"> </w:t>
-      </w:r>
-      <w:proofErr w:type="spellStart"/>
-      <w:r>
-        <w:rPr>
-          <w:rFonts w:ascii="Times New Roman" w:eastAsia="Times New Roman" w:hAnsi="Times New Roman" w:cs="Times New Roman"/>
-          <w:kern w:val="0"/>
-          <w14:ligatures w14:val="none"/>
-        </w:rPr>
-        <w:t>Nodemon</w:t>
-      </w:r>
-      <w:proofErr w:type="spellEnd"/>
+        <w:t xml:space="preserve"> Nodemon</w:t>
+      </w:r>
     </w:p>
     <w:p/>
     <w:p>
@@ -772,21 +718,12 @@
           <w:bCs/>
         </w:rPr>
       </w:pPr>
-      <w:proofErr w:type="spellStart"/>
       <w:r>
         <w:rPr>
           <w:b/>
           <w:bCs/>
         </w:rPr>
-        <w:t>npm</w:t>
-      </w:r>
-      <w:proofErr w:type="spellEnd"/>
-      <w:r>
-        <w:rPr>
-          <w:b/>
-          <w:bCs/>
-        </w:rPr>
-        <w:t xml:space="preserve"> install</w:t>
+        <w:t>npm install</w:t>
       </w:r>
     </w:p>
     <w:p>
@@ -812,22 +749,12 @@
       </w:r>
       <w:r>
         <w:br/>
-        <w:t>MONGO_URI=</w:t>
-      </w:r>
-      <w:proofErr w:type="spellStart"/>
-      <w:r>
-        <w:t>your_mongodb_connection_string</w:t>
-      </w:r>
-      <w:proofErr w:type="spellEnd"/>
+        <w:t>MONGO_URI=your_mongodb_connection_string</w:t>
+      </w:r>
       <w:r>
         <w:br/>
-        <w:t>JWT_SECRET=</w:t>
-      </w:r>
-      <w:proofErr w:type="spellStart"/>
-      <w:r>
-        <w:t>your_secret_key</w:t>
-      </w:r>
-      <w:proofErr w:type="spellEnd"/>
+        <w:t>JWT_SECRET=your_secret_key</w:t>
+      </w:r>
     </w:p>
     <w:p>
       <w:pPr>
@@ -841,13 +768,8 @@
       </w:r>
     </w:p>
     <w:p>
-      <w:proofErr w:type="spellStart"/>
-      <w:r>
-        <w:t>npm</w:t>
-      </w:r>
-      <w:proofErr w:type="spellEnd"/>
-      <w:r>
-        <w:t xml:space="preserve"> start</w:t>
+      <w:r>
+        <w:t>npm start</w:t>
       </w:r>
     </w:p>
     <w:p>
@@ -856,13 +778,8 @@
       </w:r>
     </w:p>
     <w:p>
-      <w:proofErr w:type="spellStart"/>
-      <w:r>
-        <w:t>nodemon</w:t>
-      </w:r>
-      <w:proofErr w:type="spellEnd"/>
-      <w:r>
-        <w:t xml:space="preserve"> app.js</w:t>
+      <w:r>
+        <w:t>nodemon app.js</w:t>
       </w:r>
     </w:p>
     <w:p>
@@ -898,10 +815,33 @@
         <w:t>Register a new account or log in to start submitting and managing complaints.</w:t>
       </w:r>
     </w:p>
+    <w:p/>
+    <w:p>
+      <w:pPr>
+        <w:rPr>
+          <w:b/>
+          <w:bCs/>
+          <w:sz w:val="36"/>
+          <w:szCs w:val="36"/>
+        </w:rPr>
+      </w:pPr>
+      <w:r>
+        <w:rPr>
+          <w:b/>
+          <w:bCs/>
+          <w:sz w:val="36"/>
+          <w:szCs w:val="36"/>
+        </w:rPr>
+        <w:t>Vercel link</w:t>
+      </w:r>
+    </w:p>
     <w:p>
       <w:pPr>
         <w:pStyle w:val="ListParagraph"/>
       </w:pPr>
+      <w:r>
+        <w:t>https://cms-project-e81r9oc9z-aineemator-s-projects.vercel.app/</w:t>
+      </w:r>
     </w:p>
     <w:p/>
     <w:p>
@@ -912,6 +852,7 @@
         <w:rPr>
           <w:noProof/>
         </w:rPr>
+        <w:lastRenderedPageBreak/>
         <w:drawing>
           <wp:inline distT="0" distB="0" distL="0" distR="0" wp14:anchorId="3E5B9450" wp14:editId="77CAA43F">
             <wp:extent cx="6463499" cy="2722128"/>
@@ -3207,6 +3148,7 @@
   <w:style w:type="character" w:default="1" w:styleId="DefaultParagraphFont">
     <w:name w:val="Default Paragraph Font"/>
     <w:uiPriority w:val="1"/>
+    <w:semiHidden/>
     <w:unhideWhenUsed/>
   </w:style>
   <w:style w:type="table" w:default="1" w:styleId="TableNormal">

</xml_diff>